<commit_message>
Polish DataInsight dashboard UI
</commit_message>
<xml_diff>
--- a/report/DataInsight_Report.docx
+++ b/report/DataInsight_Report.docx
@@ -219,7 +219,7 @@
             <w:r>
               <w:drawing>
                 <wp:inline xmlns:a="http://schemas.openxmlformats.org/drawingml/2006/main" xmlns:pic="http://schemas.openxmlformats.org/drawingml/2006/picture">
-                  <wp:extent cx="2788920" cy="2711450"/>
+                  <wp:extent cx="2788920" cy="2739992"/>
                   <wp:docPr id="2" name="Picture 2"/>
                   <wp:cNvGraphicFramePr>
                     <a:graphicFrameLocks noChangeAspect="1"/>
@@ -240,7 +240,7 @@
                         <pic:spPr>
                           <a:xfrm>
                             <a:off x="0" y="0"/>
-                            <a:ext cx="2788920" cy="2711450"/>
+                            <a:ext cx="2788920" cy="2739992"/>
                           </a:xfrm>
                           <a:prstGeom prst="rect"/>
                         </pic:spPr>

</xml_diff>

<commit_message>
Expand chart analysis and zoom previews
</commit_message>
<xml_diff>
--- a/report/DataInsight_Report.docx
+++ b/report/DataInsight_Report.docx
@@ -219,7 +219,7 @@
             <w:r>
               <w:drawing>
                 <wp:inline xmlns:a="http://schemas.openxmlformats.org/drawingml/2006/main" xmlns:pic="http://schemas.openxmlformats.org/drawingml/2006/picture">
-                  <wp:extent cx="2788920" cy="2739992"/>
+                  <wp:extent cx="2788920" cy="2711450"/>
                   <wp:docPr id="2" name="Picture 2"/>
                   <wp:cNvGraphicFramePr>
                     <a:graphicFrameLocks noChangeAspect="1"/>
@@ -240,7 +240,7 @@
                         <pic:spPr>
                           <a:xfrm>
                             <a:off x="0" y="0"/>
-                            <a:ext cx="2788920" cy="2739992"/>
+                            <a:ext cx="2788920" cy="2711450"/>
                           </a:xfrm>
                           <a:prstGeom prst="rect"/>
                         </pic:spPr>

</xml_diff>

<commit_message>
Replace asset references with report flowchart
</commit_message>
<xml_diff>
--- a/report/DataInsight_Report.docx
+++ b/report/DataInsight_Report.docx
@@ -67,7 +67,7 @@
       <w:r>
         <w:drawing>
           <wp:inline xmlns:a="http://schemas.openxmlformats.org/drawingml/2006/main" xmlns:pic="http://schemas.openxmlformats.org/drawingml/2006/picture">
-            <wp:extent cx="5577840" cy="2905125"/>
+            <wp:extent cx="5897880" cy="2124586"/>
             <wp:docPr id="1" name="Picture 1"/>
             <wp:cNvGraphicFramePr>
               <a:graphicFrameLocks noChangeAspect="1"/>
@@ -88,7 +88,7 @@
                   <pic:spPr>
                     <a:xfrm>
                       <a:off x="0" y="0"/>
-                      <a:ext cx="5577840" cy="2905125"/>
+                      <a:ext cx="5897880" cy="2124586"/>
                     </a:xfrm>
                     <a:prstGeom prst="rect"/>
                   </pic:spPr>
@@ -178,7 +178,7 @@
           <w:color w:val="62707F"/>
           <w:sz w:val="21"/>
         </w:rPr>
-        <w:t>Screenshots from the running local web app</w:t>
+        <w:t>Runtime behavior from the local web app</w:t>
       </w:r>
     </w:p>
     <w:tbl>
@@ -197,127 +197,33 @@
         </w:tblBorders>
       </w:tblPr>
       <w:tblGrid>
-        <w:gridCol w:w="4680"/>
-        <w:gridCol w:w="4680"/>
+        <w:gridCol w:w="3120"/>
+        <w:gridCol w:w="3120"/>
+        <w:gridCol w:w="3120"/>
       </w:tblGrid>
       <w:tr>
         <w:tc>
           <w:tcPr>
-            <w:tcW w:type="dxa" w:w="4680"/>
+            <w:tcW w:type="dxa" w:w="3120"/>
             <w:tcMar>
-              <w:top w:w="80" w:type="dxa"/>
-              <w:start w:w="120" w:type="dxa"/>
-              <w:bottom w:w="80" w:type="dxa"/>
-              <w:end w:w="120" w:type="dxa"/>
-            </w:tcMar>
-            <w:vAlign w:val="center"/>
-          </w:tcPr>
-          <w:p>
-            <w:pPr>
-              <w:jc w:val="center"/>
-            </w:pPr>
-            <w:r>
-              <w:drawing>
-                <wp:inline xmlns:a="http://schemas.openxmlformats.org/drawingml/2006/main" xmlns:pic="http://schemas.openxmlformats.org/drawingml/2006/picture">
-                  <wp:extent cx="2788920" cy="2711450"/>
-                  <wp:docPr id="2" name="Picture 2"/>
-                  <wp:cNvGraphicFramePr>
-                    <a:graphicFrameLocks noChangeAspect="1"/>
-                  </wp:cNvGraphicFramePr>
-                  <a:graphic>
-                    <a:graphicData uri="http://schemas.openxmlformats.org/drawingml/2006/picture">
-                      <pic:pic>
-                        <pic:nvPicPr>
-                          <pic:cNvPr id="0" name="screenshot-balanced.png"/>
-                          <pic:cNvPicPr/>
-                        </pic:nvPicPr>
-                        <pic:blipFill>
-                          <a:blip r:embed="rId10"/>
-                          <a:stretch>
-                            <a:fillRect/>
-                          </a:stretch>
-                        </pic:blipFill>
-                        <pic:spPr>
-                          <a:xfrm>
-                            <a:off x="0" y="0"/>
-                            <a:ext cx="2788920" cy="2711450"/>
-                          </a:xfrm>
-                          <a:prstGeom prst="rect"/>
-                        </pic:spPr>
-                      </pic:pic>
-                    </a:graphicData>
-                  </a:graphic>
-                </wp:inline>
-              </w:drawing>
-            </w:r>
-          </w:p>
-        </w:tc>
-        <w:tc>
-          <w:tcPr>
-            <w:tcW w:type="dxa" w:w="4680"/>
-            <w:tcMar>
-              <w:top w:w="80" w:type="dxa"/>
-              <w:start w:w="120" w:type="dxa"/>
-              <w:bottom w:w="80" w:type="dxa"/>
-              <w:end w:w="120" w:type="dxa"/>
-            </w:tcMar>
-            <w:vAlign w:val="center"/>
-          </w:tcPr>
-          <w:p>
-            <w:pPr>
-              <w:jc w:val="center"/>
-            </w:pPr>
-            <w:r>
-              <w:drawing>
-                <wp:inline xmlns:a="http://schemas.openxmlformats.org/drawingml/2006/main" xmlns:pic="http://schemas.openxmlformats.org/drawingml/2006/picture">
-                  <wp:extent cx="2788920" cy="2228261"/>
-                  <wp:docPr id="3" name="Picture 3"/>
-                  <wp:cNvGraphicFramePr>
-                    <a:graphicFrameLocks noChangeAspect="1"/>
-                  </wp:cNvGraphicFramePr>
-                  <a:graphic>
-                    <a:graphicData uri="http://schemas.openxmlformats.org/drawingml/2006/picture">
-                      <pic:pic>
-                        <pic:nvPicPr>
-                          <pic:cNvPr id="0" name="screenshot-analysis.png"/>
-                          <pic:cNvPicPr/>
-                        </pic:nvPicPr>
-                        <pic:blipFill>
-                          <a:blip r:embed="rId11"/>
-                          <a:stretch>
-                            <a:fillRect/>
-                          </a:stretch>
-                        </pic:blipFill>
-                        <pic:spPr>
-                          <a:xfrm>
-                            <a:off x="0" y="0"/>
-                            <a:ext cx="2788920" cy="2228261"/>
-                          </a:xfrm>
-                          <a:prstGeom prst="rect"/>
-                        </pic:spPr>
-                      </pic:pic>
-                    </a:graphicData>
-                  </a:graphic>
-                </wp:inline>
-              </w:drawing>
-            </w:r>
-          </w:p>
-        </w:tc>
-      </w:tr>
-      <w:tr>
-        <w:tc>
-          <w:tcPr>
-            <w:tcW w:type="dxa" w:w="4680"/>
-            <w:tcMar>
-              <w:top w:w="80" w:type="dxa"/>
-              <w:start w:w="120" w:type="dxa"/>
-              <w:bottom w:w="80" w:type="dxa"/>
-              <w:end w:w="120" w:type="dxa"/>
+              <w:top w:w="150" w:type="dxa"/>
+              <w:start w:w="150" w:type="dxa"/>
+              <w:bottom w:w="150" w:type="dxa"/>
+              <w:end w:w="150" w:type="dxa"/>
             </w:tcMar>
             <w:shd w:fill="F8FAFC"/>
             <w:vAlign w:val="top"/>
           </w:tcPr>
-          <w:p/>
+          <w:p>
+            <w:r>
+              <w:rPr>
+                <w:b/>
+                <w:color w:val="14766D"/>
+                <w:sz w:val="24"/>
+              </w:rPr>
+              <w:t>Perceive</w:t>
+            </w:r>
+          </w:p>
           <w:p>
             <w:pPr>
               <w:spacing w:before="60" w:after="0"/>
@@ -327,23 +233,32 @@
                 <w:color w:val="526271"/>
                 <w:sz w:val="17"/>
               </w:rPr>
-              <w:t>Balanced mode: the agent perceives data quality problems and chooses seven low-risk cleaning actions.</w:t>
+              <w:t>The user loads a CSV. The agent profiles rows, columns, data types, missing values, duplicates, outliers, and quality score.</w:t>
             </w:r>
           </w:p>
         </w:tc>
         <w:tc>
           <w:tcPr>
-            <w:tcW w:type="dxa" w:w="4680"/>
+            <w:tcW w:type="dxa" w:w="3120"/>
             <w:tcMar>
-              <w:top w:w="80" w:type="dxa"/>
-              <w:start w:w="120" w:type="dxa"/>
-              <w:bottom w:w="80" w:type="dxa"/>
-              <w:end w:w="120" w:type="dxa"/>
+              <w:top w:w="150" w:type="dxa"/>
+              <w:start w:w="150" w:type="dxa"/>
+              <w:bottom w:w="150" w:type="dxa"/>
+              <w:end w:w="150" w:type="dxa"/>
             </w:tcMar>
             <w:shd w:fill="F8FAFC"/>
             <w:vAlign w:val="top"/>
           </w:tcPr>
-          <w:p/>
+          <w:p>
+            <w:r>
+              <w:rPr>
+                <w:b/>
+                <w:color w:val="14766D"/>
+                <w:sz w:val="24"/>
+              </w:rPr>
+              <w:t>Decide</w:t>
+            </w:r>
+          </w:p>
           <w:p>
             <w:pPr>
               <w:spacing w:before="60" w:after="0"/>
@@ -353,7 +268,42 @@
                 <w:color w:val="526271"/>
                 <w:sz w:val="17"/>
               </w:rPr>
-              <w:t>Results view: the agent acts by plotting charts, previewing cleaned data, and summarizing findings.</w:t>
+              <w:t>The selected cleaning mode determines whether the agent fills, flags, caps, or standardizes values. Risk level is shown with the decision.</w:t>
+            </w:r>
+          </w:p>
+        </w:tc>
+        <w:tc>
+          <w:tcPr>
+            <w:tcW w:type="dxa" w:w="3120"/>
+            <w:tcMar>
+              <w:top w:w="150" w:type="dxa"/>
+              <w:start w:w="150" w:type="dxa"/>
+              <w:bottom w:w="150" w:type="dxa"/>
+              <w:end w:w="150" w:type="dxa"/>
+            </w:tcMar>
+            <w:shd w:fill="F8FAFC"/>
+            <w:vAlign w:val="top"/>
+          </w:tcPr>
+          <w:p>
+            <w:r>
+              <w:rPr>
+                <w:b/>
+                <w:color w:val="14766D"/>
+                <w:sz w:val="24"/>
+              </w:rPr>
+              <w:t>Act</w:t>
+            </w:r>
+          </w:p>
+          <w:p>
+            <w:pPr>
+              <w:spacing w:before="60" w:after="0"/>
+            </w:pPr>
+            <w:r>
+              <w:rPr>
+                <w:color w:val="526271"/>
+                <w:sz w:val="17"/>
+              </w:rPr>
+              <w:t>The agent cleans the rows, generates charts, summarizes findings, enables cleaned CSV export, and saves a memory checkpoint.</w:t>
             </w:r>
           </w:p>
         </w:tc>

</xml_diff>